<commit_message>
docs: sync project documentation with current state
</commit_message>
<xml_diff>
--- a/docs/crypto-quant_文件合集.docx
+++ b/docs/crypto-quant_文件合集.docx
@@ -26416,6 +26416,10 @@
     </w:p>
     <w:p>
       <w:r>
+        <w:rPr>
+          <w:rFonts w:ascii="Microsoft JhengHei" w:hAnsi="Microsoft JhengHei" w:eastAsia="?????"/>
+          <w:sz w:val="21"/>
+        </w:rPr>
         <w:t>新聞標題約六成為英文，故需英文詞庫；判讀結果一律以繁體中文顯示。</w:t>
       </w:r>
     </w:p>
@@ -26424,9 +26428,17 @@
         <w:pStyle w:val="Heading3"/>
       </w:pPr>
       <w:r>
+        <w:rPr>
+          <w:rFonts w:ascii="Microsoft JhengHei" w:hAnsi="Microsoft JhengHei" w:eastAsia="?????"/>
+          <w:sz w:val="21"/>
+        </w:rPr>
         <w:t xml:space="preserve">3-1 </w:t>
       </w:r>
       <w:r>
+        <w:rPr>
+          <w:rFonts w:ascii="Microsoft JhengHei" w:hAnsi="Microsoft JhengHei" w:eastAsia="?????"/>
+          <w:sz w:val="21"/>
+        </w:rPr>
         <w:t>看多詞（加分）</w:t>
       </w:r>
     </w:p>
@@ -28419,9 +28431,17 @@
         <w:pStyle w:val="Heading3"/>
       </w:pPr>
       <w:r>
+        <w:rPr>
+          <w:rFonts w:ascii="Microsoft JhengHei" w:hAnsi="Microsoft JhengHei" w:eastAsia="?????"/>
+          <w:sz w:val="21"/>
+        </w:rPr>
         <w:t xml:space="preserve">3-2 </w:t>
       </w:r>
       <w:r>
+        <w:rPr>
+          <w:rFonts w:ascii="Microsoft JhengHei" w:hAnsi="Microsoft JhengHei" w:eastAsia="?????"/>
+          <w:sz w:val="21"/>
+        </w:rPr>
         <w:t>看空詞（扣分）</w:t>
       </w:r>
     </w:p>
@@ -30865,18 +30885,34 @@
         <w:pStyle w:val="Heading2"/>
       </w:pPr>
       <w:r>
+        <w:rPr>
+          <w:rFonts w:ascii="Microsoft JhengHei" w:hAnsi="Microsoft JhengHei" w:eastAsia="?????"/>
+          <w:sz w:val="21"/>
+        </w:rPr>
         <w:lastRenderedPageBreak/>
         <w:t>四、繁體中文詞庫（現行，共</w:t>
       </w:r>
       <w:r>
+        <w:rPr>
+          <w:rFonts w:ascii="Microsoft JhengHei" w:hAnsi="Microsoft JhengHei" w:eastAsia="?????"/>
+          <w:sz w:val="21"/>
+        </w:rPr>
         <w:t xml:space="preserve"> 101 </w:t>
       </w:r>
       <w:r>
+        <w:rPr>
+          <w:rFonts w:ascii="Microsoft JhengHei" w:hAnsi="Microsoft JhengHei" w:eastAsia="?????"/>
+          <w:sz w:val="21"/>
+        </w:rPr>
         <w:t>詞）</w:t>
       </w:r>
     </w:p>
     <w:p>
       <w:r>
+        <w:rPr>
+          <w:rFonts w:ascii="Microsoft JhengHei" w:hAnsi="Microsoft JhengHei" w:eastAsia="?????"/>
+          <w:sz w:val="21"/>
+        </w:rPr>
         <w:t>含少量簡體「比對鍵」：部分中文媒體用簡體發稿，不加就比對不到；它們只存在於比對層，所有介面顯示均為繁體中文。</w:t>
       </w:r>
     </w:p>
@@ -30885,9 +30921,17 @@
         <w:pStyle w:val="Heading3"/>
       </w:pPr>
       <w:r>
+        <w:rPr>
+          <w:rFonts w:ascii="Microsoft JhengHei" w:hAnsi="Microsoft JhengHei" w:eastAsia="?????"/>
+          <w:sz w:val="21"/>
+        </w:rPr>
         <w:t xml:space="preserve">4-1 </w:t>
       </w:r>
       <w:r>
+        <w:rPr>
+          <w:rFonts w:ascii="Microsoft JhengHei" w:hAnsi="Microsoft JhengHei" w:eastAsia="?????"/>
+          <w:sz w:val="21"/>
+        </w:rPr>
         <w:t>看多詞（加分）</w:t>
       </w:r>
     </w:p>
@@ -32676,9 +32720,17 @@
         <w:pStyle w:val="Heading3"/>
       </w:pPr>
       <w:r>
+        <w:rPr>
+          <w:rFonts w:ascii="Microsoft JhengHei" w:hAnsi="Microsoft JhengHei" w:eastAsia="?????"/>
+          <w:sz w:val="21"/>
+        </w:rPr>
         <w:t xml:space="preserve">4-2 </w:t>
       </w:r>
       <w:r>
+        <w:rPr>
+          <w:rFonts w:ascii="Microsoft JhengHei" w:hAnsi="Microsoft JhengHei" w:eastAsia="?????"/>
+          <w:sz w:val="21"/>
+        </w:rPr>
         <w:t>看空詞（扣分）</w:t>
       </w:r>
     </w:p>
@@ -34638,6 +34690,10 @@
         <w:pStyle w:val="Heading2"/>
       </w:pPr>
       <w:r>
+        <w:rPr>
+          <w:rFonts w:ascii="Microsoft JhengHei" w:hAnsi="Microsoft JhengHei" w:eastAsia="?????"/>
+          <w:sz w:val="21"/>
+        </w:rPr>
         <w:t>五、新增詞彙申請表（請主管填寫／勾選核可）</w:t>
       </w:r>
     </w:p>
@@ -35456,24 +35512,40 @@
     </w:tbl>
     <w:p>
       <w:r>
+        <w:rPr>
+          <w:rFonts w:ascii="Microsoft JhengHei" w:hAnsi="Microsoft JhengHei" w:eastAsia="?????"/>
+          <w:sz w:val="21"/>
+        </w:rPr>
         <w:t>權重準則：</w:t>
       </w:r>
       <w:r>
         <w:rPr>
+          <w:rFonts w:ascii="Microsoft JhengHei" w:hAnsi="Microsoft JhengHei" w:eastAsia="?????"/>
           <w:b/>
+          <w:sz w:val="21"/>
         </w:rPr>
         <w:t>2 = 強烈明確</w:t>
       </w:r>
       <w:r>
+        <w:rPr>
+          <w:rFonts w:ascii="Microsoft JhengHei" w:hAnsi="Microsoft JhengHei" w:eastAsia="?????"/>
+          <w:sz w:val="21"/>
+        </w:rPr>
         <w:t>（暴跌、爆倉、駭客、崩盤）、</w:t>
       </w:r>
       <w:r>
         <w:rPr>
+          <w:rFonts w:ascii="Microsoft JhengHei" w:hAnsi="Microsoft JhengHei" w:eastAsia="?????"/>
           <w:b/>
+          <w:sz w:val="21"/>
         </w:rPr>
         <w:t>1 = 一般方向</w:t>
       </w:r>
       <w:r>
+        <w:rPr>
+          <w:rFonts w:ascii="Microsoft JhengHei" w:hAnsi="Microsoft JhengHei" w:eastAsia="?????"/>
+          <w:sz w:val="21"/>
+        </w:rPr>
         <w:t>（上漲、下跌、買入）。</w:t>
       </w:r>
     </w:p>
@@ -35482,6 +35554,10 @@
         <w:pStyle w:val="Heading2"/>
       </w:pPr>
       <w:r>
+        <w:rPr>
+          <w:rFonts w:ascii="Microsoft JhengHei" w:hAnsi="Microsoft JhengHei" w:eastAsia="?????"/>
+          <w:sz w:val="21"/>
+        </w:rPr>
         <w:t>六、容量與可用性評估</w:t>
       </w:r>
     </w:p>
@@ -35883,7 +35959,104 @@
     <w:p/>
     <w:p>
       <w:r>
+        <w:rPr>
+          <w:rFonts w:ascii="Microsoft JhengHei" w:hAnsi="Microsoft JhengHei" w:eastAsia="?????"/>
+          <w:sz w:val="21"/>
+        </w:rPr>
         <w:t>審核簽名：＿＿＿＿＿＿＿＿　　日期：＿＿＿＿＿＿＿＿</w:t>
+      </w:r>
+    </w:p>
+    <w:p>
+      <w:r>
+        <w:rPr>
+          <w:rFonts w:ascii="Microsoft JhengHei" w:hAnsi="Microsoft JhengHei" w:eastAsia="?????"/>
+          <w:sz w:val="21"/>
+        </w:rPr>
+        <w:br w:type="page"/>
+      </w:r>
+    </w:p>
+    <w:p>
+      <w:pPr>
+        <w:pStyle w:val="Heading1"/>
+      </w:pPr>
+      <w:r>
+        <w:rPr>
+          <w:rFonts w:ascii="Microsoft JhengHei" w:hAnsi="Microsoft JhengHei" w:eastAsia="?????"/>
+          <w:sz w:val="21"/>
+        </w:rPr>
+        <w:t>2026-07-13 ??????</w:t>
+      </w:r>
+    </w:p>
+    <w:p>
+      <w:pPr>
+        <w:pStyle w:val="ListBullet"/>
+      </w:pPr>
+      <w:r>
+        <w:rPr>
+          <w:rFonts w:ascii="Microsoft JhengHei" w:hAnsi="Microsoft JhengHei" w:eastAsia="?????"/>
+          <w:sz w:val="21"/>
+        </w:rPr>
+        <w:t>README ??????????AIAnalystPanel?CorrelationHeatmap?BotWidget?OnboardingTour?MacroPanel ??????????</w:t>
+      </w:r>
+    </w:p>
+    <w:p>
+      <w:pPr>
+        <w:pStyle w:val="ListBullet"/>
+      </w:pPr>
+      <w:r>
+        <w:rPr>
+          <w:rFonts w:ascii="Microsoft JhengHei" w:hAnsi="Microsoft JhengHei" w:eastAsia="?????"/>
+          <w:sz w:val="21"/>
+        </w:rPr>
+        <w:t>??????????? cd frontend ? npm run start?</w:t>
+      </w:r>
+    </w:p>
+    <w:p>
+      <w:pPr>
+        <w:pStyle w:val="ListBullet"/>
+      </w:pPr>
+      <w:r>
+        <w:rPr>
+          <w:rFonts w:ascii="Microsoft JhengHei" w:hAnsi="Microsoft JhengHei" w:eastAsia="?????"/>
+          <w:sz w:val="21"/>
+        </w:rPr>
+        <w:t>????????app.db ? 28.7 MB?news.db ? 3.0 MB?prices/indicators ? 63,119 ??tasks 137 ??access_log ????????</w:t>
+      </w:r>
+    </w:p>
+    <w:p>
+      <w:pPr>
+        <w:pStyle w:val="ListBullet"/>
+      </w:pPr>
+      <w:r>
+        <w:rPr>
+          <w:rFonts w:ascii="Microsoft JhengHei" w:hAnsi="Microsoft JhengHei" w:eastAsia="?????"/>
+          <w:sz w:val="21"/>
+        </w:rPr>
+        <w:t>?????????????????????? tasks ????</w:t>
+      </w:r>
+    </w:p>
+    <w:p>
+      <w:pPr>
+        <w:pStyle w:val="ListBullet"/>
+      </w:pPr>
+      <w:r>
+        <w:rPr>
+          <w:rFonts w:ascii="Microsoft JhengHei" w:hAnsi="Microsoft JhengHei" w:eastAsia="?????"/>
+          <w:sz w:val="21"/>
+        </w:rPr>
+        <w:t>???????secrets.local.cmd ???? ADMIN_PASS / ADMIN_SECRET?OPENAI_API_KEY ????????? AI ?????</w:t>
+      </w:r>
+    </w:p>
+    <w:p>
+      <w:pPr>
+        <w:pStyle w:val="ListBullet"/>
+      </w:pPr>
+      <w:r>
+        <w:rPr>
+          <w:rFonts w:ascii="Microsoft JhengHei" w:hAnsi="Microsoft JhengHei" w:eastAsia="?????"/>
+          <w:sz w:val="21"/>
+        </w:rPr>
+        <w:t>MATICUSDT ? data/reports ??????????????? 15 ???? POLUSDT?</w:t>
       </w:r>
     </w:p>
     <w:sectPr>

</xml_diff>